<commit_message>
fix: Update team member names and roll numbers in report files to Ansh Devkate, Purvi Kalhapure, and Nishigandha Ingle
</commit_message>
<xml_diff>
--- a/NOVA_lab_Mini_Project_Report.docx
+++ b/NOVA_lab_Mini_Project_Report.docx
@@ -155,13 +155,11 @@
           <w:b/>
           <w:sz w:val="24"/>
         </w:rPr>
-        <w:t>Gaikwad Vaibhav – 24CO034</w:t>
+        <w:t>Ansh Devkate – 24CO024</w:t>
         <w:br/>
-        <w:t>Hanny Jangir - 24CO040</w:t>
+        <w:t>Purvi Kalhapure – 24CO054</w:t>
         <w:br/>
-        <w:t>Janhavi Adagale – 24CO052</w:t>
-        <w:br/>
-        <w:t>Joshi Aabha – 24CO053</w:t>
+        <w:t>Nishigandha Ingle – 24CO041</w:t>
       </w:r>
     </w:p>
     <w:p>
@@ -330,7 +328,7 @@
           <w:i w:val="0"/>
           <w:sz w:val="24"/>
         </w:rPr>
-        <w:t>Vaibhav Gaikwad (24CO034)</w:t>
+        <w:t>Ansh Devkate (24CO024)</w:t>
       </w:r>
       <w:r>
         <w:rPr>
@@ -348,25 +346,7 @@
           <w:i w:val="0"/>
           <w:sz w:val="24"/>
         </w:rPr>
-        <w:t>Hanny Jangir (24CO040)</w:t>
-      </w:r>
-      <w:r>
-        <w:rPr>
-          <w:rFonts w:ascii="Times New Roman" w:hAnsi="Times New Roman"/>
-          <w:b w:val="0"/>
-          <w:i w:val="0"/>
-          <w:sz w:val="24"/>
-        </w:rPr>
-        <w:t xml:space="preserve">, </w:t>
-      </w:r>
-      <w:r>
-        <w:rPr>
-          <w:rFonts w:ascii="Times New Roman" w:hAnsi="Times New Roman"/>
-          <w:b/>
-          <w:i w:val="0"/>
-          <w:sz w:val="24"/>
-        </w:rPr>
-        <w:t>Janhavi Adagale (24CO052)</w:t>
+        <w:t>Purvi Kalhapure (24CO054)</w:t>
       </w:r>
       <w:r>
         <w:rPr>
@@ -384,7 +364,7 @@
           <w:i w:val="0"/>
           <w:sz w:val="24"/>
         </w:rPr>
-        <w:t>Joshi Aabha (24CO053)</w:t>
+        <w:t>Nishigandha Ingle (24CO041)</w:t>
       </w:r>
       <w:r>
         <w:rPr>
@@ -524,13 +504,11 @@
           <w:b/>
           <w:sz w:val="24"/>
         </w:rPr>
-        <w:t>Gaikwad Vaibhav – 24CO034</w:t>
+        <w:t>Ansh Devkate – 24CO024</w:t>
         <w:br/>
-        <w:t>Hanny Jangir - 24CO040</w:t>
+        <w:t>Purvi Kalhapure – 24CO054</w:t>
         <w:br/>
-        <w:t>Janhavi Adagale – 24CO052</w:t>
-        <w:br/>
-        <w:t>Joshi Aabha – 24CO053</w:t>
+        <w:t>Nishigandha Ingle – 24CO041</w:t>
       </w:r>
     </w:p>
     <w:p>
@@ -741,7 +719,7 @@
           <w:i w:val="0"/>
           <w:sz w:val="24"/>
         </w:rPr>
-        <w:t>We sincerely acknowledge the dedicated contributions, cooperation, and consistent efforts of all our team members: Vaibhav Gaikwad, Hanny Jangir, Janhavi Adagale, and Joshi Aabha. The successful completion of this project was possible because of the active participation, shared responsibility, and effective teamwork of every member.</w:t>
+        <w:t>We sincerely acknowledge the dedicated contributions, cooperation, and consistent efforts of all our team members: Ansh Devkate, Purvi Kalhapure, and Nishigandha Ingle. The successful completion of this project was possible because of the active participation, shared responsibility, and effective teamwork of every member.</w:t>
       </w:r>
     </w:p>
     <w:p>

</xml_diff>